<commit_message>
fix: programme reads oralData.objectives; extract objectives on generate-final; legal title auto-set; fix Entreprise field; bulk patch 8 candidates
</commit_message>
<xml_diff>
--- a/data/conventions/convention_910a42a9af0182eaf1fe109e22b7054378e041ab.docx
+++ b/data/conventions/convention_910a42a9af0182eaf1fe109e22b7054378e041ab.docx
@@ -351,6 +351,8 @@
         <w:ind w:left="426" w:right="-431"/>
         <w:rPr>
           <w:rFonts w:ascii="Avenir Next Regular" w:eastAsia="Calibri" w:hAnsi="Avenir Next Regular" w:cs="Browallia New"/>
+          <w:b/>
+          <w:bCs/>
           <w:lang w:val="fr-FR"/>
         </w:rPr>
       </w:pPr>
@@ -359,7 +361,16 @@
           <w:rFonts w:ascii="Avenir Next Regular" w:eastAsia="Calibri" w:hAnsi="Avenir Next Regular" w:cs="Browallia New"/>
           <w:lang w:val="fr-FR"/>
         </w:rPr>
-        <w:t>Durée de l’action de formation : 20 heures (10h formation + 10h travail autonome) heures</w:t>
+        <w:t xml:space="preserve">Durée de l’action de formation : </w:t>
+      </w:r>
+      <w:r>
+        <w:rPr>
+          <w:rFonts w:ascii="Avenir Next Regular" w:eastAsia="Calibri" w:hAnsi="Avenir Next Regular" w:cs="Browallia New"/>
+          <w:b/>
+          <w:bCs/>
+          <w:lang w:val="fr-FR"/>
+        </w:rPr>
+        <w:t>20 heures</w:t>
       </w:r>
     </w:p>
     <w:p>
@@ -411,7 +422,16 @@
           <w:rFonts w:ascii="Avenir Next Regular" w:eastAsia="Calibri" w:hAnsi="Avenir Next Regular" w:cs="Browallia New"/>
           <w:lang w:val="fr-FR"/>
         </w:rPr>
-        <w:t>Dates : du 6 juillet 2026 au 30 septembre 2026</w:t>
+        <w:t xml:space="preserve">Dates : </w:t>
+      </w:r>
+      <w:r>
+        <w:rPr>
+          <w:rFonts w:ascii="Avenir Next Regular" w:eastAsia="Calibri" w:hAnsi="Avenir Next Regular" w:cs="Browallia New"/>
+          <w:b/>
+          <w:bCs/>
+          <w:lang w:val="fr-FR"/>
+        </w:rPr>
+        <w:t>du 6 juillet 2026 au 30 septembre 2026</w:t>
       </w:r>
     </w:p>
     <w:p>
@@ -483,51 +503,6 @@
           <w:lang w:val="fr-FR"/>
         </w:rPr>
         <w:t>(B1 minimum)</w:t>
-      </w:r>
-      <w:r>
-        <w:rPr>
-          <w:rFonts w:ascii="Avenir Next Regular" w:eastAsia="Calibri" w:hAnsi="Avenir Next Regular" w:cs="Browallia New"/>
-          <w:sz w:val="19"/>
-          <w:szCs w:val="19"/>
-          <w:lang w:val="fr-FR"/>
-        </w:rPr>
-        <w:t xml:space="preserve">. </w:t>
-      </w:r>
-    </w:p>
-    <w:p>
-      <w:pPr>
-        <w:pStyle w:val="Normal10"/>
-        <w:numPr>
-          <w:ilvl w:val="0"/>
-          <w:numId w:val="34"/>
-        </w:numPr>
-        <w:ind w:left="426" w:right="-431"/>
-        <w:rPr>
-          <w:rFonts w:ascii="Avenir Next Regular" w:eastAsia="Calibri" w:hAnsi="Avenir Next Regular" w:cs="Browallia New"/>
-          <w:sz w:val="19"/>
-          <w:szCs w:val="19"/>
-          <w:lang w:val="fr-FR"/>
-        </w:rPr>
-      </w:pPr>
-      <w:r>
-        <w:rPr>
-          <w:rFonts w:ascii="Avenir Next Regular" w:eastAsia="Calibri" w:hAnsi="Avenir Next Regular" w:cs="Browallia New"/>
-          <w:sz w:val="19"/>
-          <w:szCs w:val="19"/>
-          <w:lang w:val="fr-FR"/>
-        </w:rPr>
-        <w:t xml:space="preserve">Niveau visé : </w:t>
-      </w:r>
-      <w:r>
-        <w:rPr>
-          <w:rFonts w:ascii="Avenir Next Regular" w:eastAsia="Calibri" w:hAnsi="Avenir Next Regular" w:cs="Browallia New"/>
-          <w:b/>
-          <w:bCs/>
-          <w:sz w:val="19"/>
-          <w:szCs w:val="19"/>
-          <w:lang w:val="fr-FR"/>
-        </w:rPr>
-        <w:t>B2 en anglais professionnel</w:t>
       </w:r>
       <w:r>
         <w:rPr>
@@ -733,7 +708,23 @@
           <w:rFonts w:ascii="Avenir Next Regular" w:eastAsia="Calibri" w:hAnsi="Avenir Next Regular" w:cs="Browallia New"/>
           <w:lang w:val="fr-FR"/>
         </w:rPr>
-        <w:t>Les frais de formation sont : 1650 EUROS NET DE TAXES* à payer à réception de facture. En cas de financement par le CPF, la facturation sera faite directement à la plateforme . Un solde de financement par le participant et/ou son employeur est également possible. Ces tarifs comprennent les frais pédagogiques. (*Conformément à l’article 261-4-4° du Code général des impôts, nos activités de formation professionnelle continue sont exonérées de T.V.A.)</w:t>
+        <w:t xml:space="preserve">Les frais de formation sont : </w:t>
+      </w:r>
+      <w:r>
+        <w:rPr>
+          <w:rFonts w:ascii="Avenir Next Regular" w:eastAsia="Calibri" w:hAnsi="Avenir Next Regular" w:cs="Browallia New"/>
+          <w:lang w:val="fr-FR"/>
+          <w:b/>
+          <w:bCs/>
+        </w:rPr>
+        <w:t>1650 EUROS NET DE TAXES*</w:t>
+      </w:r>
+      <w:r>
+        <w:rPr>
+          <w:rFonts w:ascii="Avenir Next Regular" w:eastAsia="Calibri" w:hAnsi="Avenir Next Regular" w:cs="Browallia New"/>
+          <w:lang w:val="fr-FR"/>
+        </w:rPr>
+        <w:t xml:space="preserve"> à payer à réception de facture. En cas de financement par le CPF, la facturation sera faite directement à la plateforme . Un solde de financement par le participant et/ou son employeur est également possible. Ces tarifs comprennent les frais pédagogiques. (*Conformément à l’article 261-4-4° du Code général des impôts, nos activités de formation professionnelle continue sont exonérées de T.V.A.)</w:t>
       </w:r>
       <w:hyperlink r:id="rId9" w:history="1">
         <w:r>
@@ -1173,28 +1164,7 @@
           <w:rFonts w:ascii="Avenir Next Regular" w:eastAsia="Calibri" w:hAnsi="Avenir Next Regular" w:cs="Browallia New"/>
           <w:lang w:val="fr-FR"/>
         </w:rPr>
-        <w:t>Fait en double exemplaire, à Saint-Cyprien le 10 juin 2026</w:t>
-        <w:tab/>
-        <w:tab/>
-        <w:tab/>
-      </w:r>
-      <w:r>
-        <w:rPr>
-          <w:rFonts w:ascii="Avenir Next Regular" w:eastAsia="Calibri" w:hAnsi="Avenir Next Regular" w:cs="Browallia New"/>
-          <w:lang w:val="fr-FR"/>
-        </w:rPr>
-      </w:r>
-      <w:r>
-        <w:rPr>
-          <w:rFonts w:ascii="Avenir Next Regular" w:eastAsia="Calibri" w:hAnsi="Avenir Next Regular" w:cs="Browallia New"/>
-          <w:lang w:val="fr-FR"/>
-        </w:rPr>
-      </w:r>
-      <w:r>
-        <w:rPr>
-          <w:rFonts w:ascii="Avenir Next Regular" w:eastAsia="Calibri" w:hAnsi="Avenir Next Regular" w:cs="Browallia New"/>
-          <w:lang w:val="fr-FR"/>
-        </w:rPr>
+        <w:t>Fait en double exemplaire, à Saint-Cyprien le 19 juin 2026</w:t>
       </w:r>
     </w:p>
     <w:p>
@@ -1209,77 +1179,166 @@
         </w:rPr>
       </w:pPr>
     </w:p>
-    <w:p>
-      <w:pPr>
-        <w:pStyle w:val="Normal10"/>
-        <w:ind w:left="-426" w:right="-431"/>
-        <w:rPr>
-          <w:rFonts w:ascii="Avenir Next Regular" w:hAnsi="Avenir Next Regular"/>
-          <w:b/>
-          <w:bCs/>
-          <w:color w:val="1F497D" w:themeColor="text2"/>
-          <w:lang w:val="fr-FR"/>
-        </w:rPr>
-        <w:sectPr>
-          <w:type w:val="continuous"/>
-          <w:pgSz w:w="11900" w:h="16820" w:code="297"/>
-          <w:pgMar w:top="1334" w:right="1274" w:bottom="1005" w:left="1418" w:header="0" w:footer="1106" w:gutter="0"/>
-          <w:cols w:space="708"/>
-          <w:docGrid w:linePitch="360"/>
-        </w:sectPr>
-      </w:pPr>
-      <w:r>
-        <w:rPr>
-          <w:rFonts w:ascii="Avenir Next Regular" w:hAnsi="Avenir Next Regular"/>
-          <w:b/>
-          <w:bCs/>
-          <w:color w:val="1F497D" w:themeColor="text2"/>
-          <w:lang w:val="fr-FR"/>
-        </w:rPr>
-        <w:t>Pour Madame AICHA FETTAH</w:t>
-        <w:tab/>
-        <w:tab/>
-        <w:tab/>
-        <w:tab/>
-        <w:t>Pour l’organisme LINGUAID FRANCE</w:t>
-      </w:r>
-      <w:r>
-        <w:rPr>
-          <w:rFonts w:ascii="Avenir Next Regular" w:hAnsi="Avenir Next Regular"/>
-          <w:b/>
-          <w:bCs/>
-          <w:color w:val="1F497D" w:themeColor="text2"/>
-          <w:lang w:val="fr-FR"/>
-        </w:rPr>
-      </w:r>
-      <w:r>
-        <w:rPr>
-          <w:rFonts w:ascii="Avenir Next Regular" w:hAnsi="Avenir Next Regular"/>
-          <w:b/>
-          <w:bCs/>
-          <w:color w:val="1F497D" w:themeColor="text2"/>
-          <w:lang w:val="fr-FR"/>
-        </w:rPr>
-      </w:r>
-      <w:r>
-        <w:rPr>
-          <w:rFonts w:ascii="Avenir Next Regular" w:hAnsi="Avenir Next Regular"/>
-          <w:b/>
-          <w:bCs/>
-          <w:color w:val="1F497D" w:themeColor="text2"/>
-          <w:lang w:val="fr-FR"/>
-        </w:rPr>
-      </w:r>
-      <w:r>
-        <w:rPr>
-          <w:rFonts w:ascii="Avenir Next Regular" w:hAnsi="Avenir Next Regular"/>
-          <w:b/>
-          <w:bCs/>
-          <w:color w:val="1F497D" w:themeColor="text2"/>
-          <w:lang w:val="fr-FR"/>
-        </w:rPr>
-      </w:r>
-    </w:p>
+    <w:tbl>
+      <w:tblPr>
+        <w:tblW w:w="9360" w:type="dxa"/>
+        <w:tblLook w:val="04A0" w:firstRow="1" w:lastRow="0" w:firstColumn="1" w:lastColumn="0" w:noHBand="0" w:noVBand="1"/>
+      </w:tblPr>
+      <w:tblGrid>
+        <w:gridCol w:w="4680"/>
+        <w:gridCol w:w="4680"/>
+      </w:tblGrid>
+      <w:tr>
+        <w:tc>
+          <w:tcPr>
+            <w:tcW w:w="4680" w:type="dxa"/>
+          </w:tcPr>
+          <w:p>
+            <w:pPr>
+              <w:spacing w:after="120"/>
+            </w:pPr>
+            <w:r>
+              <w:rPr>
+                <w:rFonts w:ascii="Avenir Next Regular" w:hAnsi="Avenir Next Regular"/>
+                <w:b/>
+                <w:bCs/>
+                <w:color w:val="1F497D" w:themeColor="text2"/>
+              </w:rPr>
+              <w:t>Pour Madame AICHA FETTAH</w:t>
+            </w:r>
+          </w:p>
+        </w:tc>
+        <w:tc>
+          <w:tcPr>
+            <w:tcW w:w="4680" w:type="dxa"/>
+          </w:tcPr>
+          <w:p>
+            <w:pPr>
+              <w:spacing w:after="120"/>
+            </w:pPr>
+            <w:r>
+              <w:rPr>
+                <w:rFonts w:ascii="Avenir Next Regular" w:hAnsi="Avenir Next Regular"/>
+                <w:b/>
+                <w:bCs/>
+                <w:color w:val="1F497D" w:themeColor="text2"/>
+              </w:rPr>
+              <w:t>Pour l’organisme LINGUAID FRANCE</w:t>
+            </w:r>
+          </w:p>
+        </w:tc>
+      </w:tr>
+      <w:tr>
+        <w:tc>
+          <w:tcPr>
+            <w:tcW w:w="4680" w:type="dxa"/>
+          </w:tcPr>
+          <w:p>
+            <w:pPr>
+              <w:spacing w:after="120"/>
+            </w:pPr>
+          </w:p>
+        </w:tc>
+        <w:tc>
+          <w:tcPr>
+            <w:tcW w:w="4680" w:type="dxa"/>
+          </w:tcPr>
+          <w:p>
+            <w:pPr>
+              <w:spacing w:after="120"/>
+            </w:pPr>
+          </w:p>
+        </w:tc>
+      </w:tr>
+      <w:tr>
+        <w:tc>
+          <w:tcPr>
+            <w:tcW w:w="4680" w:type="dxa"/>
+          </w:tcPr>
+          <w:p>
+            <w:pPr>
+              <w:spacing w:after="120"/>
+            </w:pPr>
+          </w:p>
+        </w:tc>
+        <w:tc>
+          <w:tcPr>
+            <w:tcW w:w="4680" w:type="dxa"/>
+          </w:tcPr>
+          <w:p>
+            <w:pPr>
+              <w:spacing w:after="120"/>
+            </w:pPr>
+          </w:p>
+        </w:tc>
+      </w:tr>
+      <w:tr>
+        <w:tc>
+          <w:tcPr>
+            <w:tcW w:w="4680" w:type="dxa"/>
+          </w:tcPr>
+          <w:p>
+            <w:pPr>
+              <w:spacing w:after="120"/>
+            </w:pPr>
+          </w:p>
+        </w:tc>
+        <w:tc>
+          <w:tcPr>
+            <w:tcW w:w="4680" w:type="dxa"/>
+          </w:tcPr>
+          <w:p>
+            <w:pPr>
+              <w:spacing w:after="120"/>
+            </w:pPr>
+          </w:p>
+        </w:tc>
+      </w:tr>
+      <w:tr>
+        <w:tc>
+          <w:tcPr>
+            <w:tcW w:w="4680" w:type="dxa"/>
+          </w:tcPr>
+          <w:p>
+            <w:pPr>
+              <w:spacing w:after="120"/>
+            </w:pPr>
+          </w:p>
+        </w:tc>
+        <w:tc>
+          <w:tcPr>
+            <w:tcW w:w="4680" w:type="dxa"/>
+          </w:tcPr>
+          <w:p>
+            <w:pPr>
+              <w:spacing w:after="120"/>
+            </w:pPr>
+          </w:p>
+        </w:tc>
+      </w:tr>
+      <w:tr>
+        <w:tc>
+          <w:tcPr>
+            <w:tcW w:w="4680" w:type="dxa"/>
+          </w:tcPr>
+          <w:p>
+            <w:pPr>
+              <w:spacing w:after="120"/>
+            </w:pPr>
+          </w:p>
+        </w:tc>
+        <w:tc>
+          <w:tcPr>
+            <w:tcW w:w="4680" w:type="dxa"/>
+          </w:tcPr>
+          <w:p>
+            <w:pPr>
+              <w:spacing w:after="120"/>
+            </w:pPr>
+          </w:p>
+        </w:tc>
+      </w:tr>
+    </w:tbl>
     <w:p>
       <w:pPr>
         <w:pStyle w:val="Normal10"/>
@@ -1434,14 +1493,14 @@
                       </a:ln>
                       <a:extLst>
                         <a:ext uri="{909E8E84-426E-40dd-AFC4-6F175D3DCCD1}">
-                          <a14:hiddenFill xmlns:a14="http://schemas.microsoft.com/office/drawing/2010/main" xmlns:w="http://schemas.openxmlformats.org/wordprocessingml/2006/main" xmlns:w10="urn:schemas-microsoft-com:office:word" xmlns:v="urn:schemas-microsoft-com:vml" xmlns:o="urn:schemas-microsoft-com:office:office" xmlns:mv="urn:schemas-microsoft-com:mac:vml" xmlns:mo="http://schemas.microsoft.com/office/mac/office/2008/main" xmlns="">
+                          <a14:hiddenFill xmlns="" xmlns:mo="http://schemas.microsoft.com/office/mac/office/2008/main" xmlns:mv="urn:schemas-microsoft-com:mac:vml" xmlns:o="urn:schemas-microsoft-com:office:office" xmlns:v="urn:schemas-microsoft-com:vml" xmlns:w10="urn:schemas-microsoft-com:office:word" xmlns:w="http://schemas.openxmlformats.org/wordprocessingml/2006/main" xmlns:a14="http://schemas.microsoft.com/office/drawing/2010/main">
                             <a:solidFill>
                               <a:srgbClr val="00CC99"/>
                             </a:solidFill>
                           </a14:hiddenFill>
                         </a:ext>
                         <a:ext uri="{91240B29-F687-4f45-9708-019B960494DF}">
-                          <a14:hiddenLine xmlns:a14="http://schemas.microsoft.com/office/drawing/2010/main" xmlns:w="http://schemas.openxmlformats.org/wordprocessingml/2006/main" xmlns:w10="urn:schemas-microsoft-com:office:word" xmlns:v="urn:schemas-microsoft-com:vml" xmlns:o="urn:schemas-microsoft-com:office:office" xmlns:mv="urn:schemas-microsoft-com:mac:vml" xmlns:mo="http://schemas.microsoft.com/office/mac/office/2008/main" xmlns="" w="9525">
+                          <a14:hiddenLine xmlns="" xmlns:mo="http://schemas.microsoft.com/office/mac/office/2008/main" xmlns:mv="urn:schemas-microsoft-com:mac:vml" xmlns:o="urn:schemas-microsoft-com:office:office" xmlns:v="urn:schemas-microsoft-com:vml" xmlns:w10="urn:schemas-microsoft-com:office:word" xmlns:w="http://schemas.openxmlformats.org/wordprocessingml/2006/main" xmlns:a14="http://schemas.microsoft.com/office/drawing/2010/main" w="9525">
                             <a:solidFill>
                               <a:srgbClr val="000000"/>
                             </a:solidFill>
@@ -1848,14 +1907,14 @@
                       </a:ln>
                       <a:extLst>
                         <a:ext uri="{909E8E84-426E-40dd-AFC4-6F175D3DCCD1}">
-                          <a14:hiddenFill xmlns:a14="http://schemas.microsoft.com/office/drawing/2010/main" xmlns:w="http://schemas.openxmlformats.org/wordprocessingml/2006/main" xmlns:w10="urn:schemas-microsoft-com:office:word" xmlns:v="urn:schemas-microsoft-com:vml" xmlns:o="urn:schemas-microsoft-com:office:office" xmlns:mv="urn:schemas-microsoft-com:mac:vml" xmlns:mo="http://schemas.microsoft.com/office/mac/office/2008/main" xmlns="">
+                          <a14:hiddenFill xmlns="" xmlns:mo="http://schemas.microsoft.com/office/mac/office/2008/main" xmlns:mv="urn:schemas-microsoft-com:mac:vml" xmlns:o="urn:schemas-microsoft-com:office:office" xmlns:v="urn:schemas-microsoft-com:vml" xmlns:w10="urn:schemas-microsoft-com:office:word" xmlns:w="http://schemas.openxmlformats.org/wordprocessingml/2006/main" xmlns:a14="http://schemas.microsoft.com/office/drawing/2010/main">
                             <a:solidFill>
                               <a:srgbClr val="00CC99"/>
                             </a:solidFill>
                           </a14:hiddenFill>
                         </a:ext>
                         <a:ext uri="{91240B29-F687-4f45-9708-019B960494DF}">
-                          <a14:hiddenLine xmlns:a14="http://schemas.microsoft.com/office/drawing/2010/main" xmlns:w="http://schemas.openxmlformats.org/wordprocessingml/2006/main" xmlns:w10="urn:schemas-microsoft-com:office:word" xmlns:v="urn:schemas-microsoft-com:vml" xmlns:o="urn:schemas-microsoft-com:office:office" xmlns:mv="urn:schemas-microsoft-com:mac:vml" xmlns:mo="http://schemas.microsoft.com/office/mac/office/2008/main" xmlns="" w="9525">
+                          <a14:hiddenLine xmlns="" xmlns:mo="http://schemas.microsoft.com/office/mac/office/2008/main" xmlns:mv="urn:schemas-microsoft-com:mac:vml" xmlns:o="urn:schemas-microsoft-com:office:office" xmlns:v="urn:schemas-microsoft-com:vml" xmlns:w10="urn:schemas-microsoft-com:office:word" xmlns:w="http://schemas.openxmlformats.org/wordprocessingml/2006/main" xmlns:a14="http://schemas.microsoft.com/office/drawing/2010/main" w="9525">
                             <a:solidFill>
                               <a:srgbClr val="000000"/>
                             </a:solidFill>
@@ -2328,7 +2387,7 @@
                       <a:effectLst/>
                       <a:extLst>
                         <a:ext uri="{C572A759-6A51-4108-AA02-DFA0A04FC94B}">
-                          <ma14:wrappingTextBoxFlag xmlns:ma14="http://schemas.microsoft.com/office/mac/drawingml/2011/main" xmlns:w="http://schemas.openxmlformats.org/wordprocessingml/2006/main" xmlns:w10="urn:schemas-microsoft-com:office:word" xmlns:v="urn:schemas-microsoft-com:vml" xmlns:o="urn:schemas-microsoft-com:office:office" xmlns:mv="urn:schemas-microsoft-com:mac:vml" xmlns:mo="http://schemas.microsoft.com/office/mac/office/2008/main" xmlns=""/>
+                          <ma14:wrappingTextBoxFlag xmlns="" xmlns:mo="http://schemas.microsoft.com/office/mac/office/2008/main" xmlns:mv="urn:schemas-microsoft-com:mac:vml" xmlns:o="urn:schemas-microsoft-com:office:office" xmlns:v="urn:schemas-microsoft-com:vml" xmlns:w10="urn:schemas-microsoft-com:office:word" xmlns:w="http://schemas.openxmlformats.org/wordprocessingml/2006/main" xmlns:ma14="http://schemas.microsoft.com/office/mac/drawingml/2011/main"/>
                         </a:ext>
                       </a:extLst>
                     </wps:spPr>

</xml_diff>